<commit_message>
Correccion clinica critica: PARACETAMOL IV en < 10 kg
PARACETAMOL IV: separada la pauta unica en dos pautas seguras segun
Pediamecum (AEPED):

- Pauta < 10 kg (lactantes y neonatos): 7,5 mg/kg/dosis cada 6 h,
  max 30 mg/kg/dia. En pretermino > 32 sem cada 8-12 h.
- Pauta >= 10 kg: 15 mg/kg/dosis cada 6 h, max 1 g/dosis y 4 g/dia.
  Nota detalla escalonado por peso (10-33 / 33-50 / >50 kg).

Importante: la version anterior aplicaba 15 mg/kg a TODOS los pesos,
sobredosificando a los lactantes menores de 10 kg al doble de la dosis
correcta. Corregido segun la ficha de Pediamecum/AEPED.

Auditoria de otras dosis IV ajustadas por peso revisada en esta tanda
(metamizol, ibuprofeno, glucosa hipertonica, propranolol IV,
gentamicina, heparina, digoxina, succinilcolina): sin cambios
adicionales necesarios.

SW v8 -> v9 para que aparezca el banner 'Nueva version disponible'
en las PWAs instaladas con la correccion.
</commit_message>
<xml_diff>
--- a/DosisPed-Manual.docx
+++ b/DosisPed-Manual.docx
@@ -1,6 +1,6 @@
 
 <file path=word/document.xml><?xml version="1.0" encoding="utf-8"?>
-<w:document xmlns:wpc="http://schemas.microsoft.com/office/word/2010/wordprocessingCanvas" xmlns:cx="http://schemas.microsoft.com/office/drawing/2014/chartex" xmlns:cx1="http://schemas.microsoft.com/office/drawing/2015/9/8/chartex" xmlns:cx2="http://schemas.microsoft.com/office/drawing/2015/10/21/chartex" xmlns:cx3="http://schemas.microsoft.com/office/drawing/2016/5/9/chartex" xmlns:cx4="http://schemas.microsoft.com/office/drawing/2016/5/10/chartex" xmlns:cx5="http://schemas.microsoft.com/office/drawing/2016/5/11/chartex" xmlns:cx6="http://schemas.microsoft.com/office/drawing/2016/5/12/chartex" xmlns:cx7="http://schemas.microsoft.com/office/drawing/2016/5/13/chartex" xmlns:cx8="http://schemas.microsoft.com/office/drawing/2016/5/14/chartex" xmlns:mc="http://schemas.openxmlformats.org/markup-compatibility/2006" xmlns:aink="http://schemas.microsoft.com/office/drawing/2016/ink" xmlns:am3d="http://schemas.microsoft.com/office/drawing/2017/model3d" xmlns:o="urn:schemas-microsoft-com:office:office" xmlns:oel="http://schemas.microsoft.com/office/2019/extlst" xmlns:r="http://schemas.openxmlformats.org/officeDocument/2006/relationships" xmlns:m="http://schemas.openxmlformats.org/officeDocument/2006/math" xmlns:v="urn:schemas-microsoft-com:vml" xmlns:wp14="http://schemas.microsoft.com/office/word/2010/wordprocessingDrawing" xmlns:wp="http://schemas.openxmlformats.org/drawingml/2006/wordprocessingDrawing" xmlns:w10="urn:schemas-microsoft-com:office:word" xmlns:w="http://schemas.openxmlformats.org/wordprocessingml/2006/main" xmlns:w14="http://schemas.microsoft.com/office/word/2010/wordml" xmlns:w15="http://schemas.microsoft.com/office/word/2012/wordml" xmlns:w16cex="http://schemas.microsoft.com/office/word/2018/wordml/cex" xmlns:w16cid="http://schemas.microsoft.com/office/word/2016/wordml/cid" xmlns:w16="http://schemas.microsoft.com/office/word/2018/wordml" xmlns:w16du="http://schemas.microsoft.com/office/word/2023/wordml/word16du" xmlns:w16sdtdh="http://schemas.microsoft.com/office/word/2020/wordml/sdtdatahash" xmlns:w16se="http://schemas.microsoft.com/office/word/2015/wordml/symex" xmlns:wpg="http://schemas.microsoft.com/office/word/2010/wordprocessingGroup" xmlns:wpi="http://schemas.microsoft.com/office/word/2010/wordprocessingInk" xmlns:wne="http://schemas.microsoft.com/office/word/2006/wordml" xmlns:wps="http://schemas.microsoft.com/office/word/2010/wordprocessingShape" mc:Ignorable="w14 w15 w16se w16cid w16 w16cex w16sdtdh w16du wp14">
+<w:document xmlns:wpc="http://schemas.microsoft.com/office/word/2010/wordprocessingCanvas" xmlns:cx="http://schemas.microsoft.com/office/drawing/2014/chartex" xmlns:cx1="http://schemas.microsoft.com/office/drawing/2015/9/8/chartex" xmlns:cx2="http://schemas.microsoft.com/office/drawing/2015/10/21/chartex" xmlns:cx3="http://schemas.microsoft.com/office/drawing/2016/5/9/chartex" xmlns:cx4="http://schemas.microsoft.com/office/drawing/2016/5/10/chartex" xmlns:cx5="http://schemas.microsoft.com/office/drawing/2016/5/11/chartex" xmlns:cx6="http://schemas.microsoft.com/office/drawing/2016/5/12/chartex" xmlns:cx7="http://schemas.microsoft.com/office/drawing/2016/5/13/chartex" xmlns:cx8="http://schemas.microsoft.com/office/drawing/2016/5/14/chartex" xmlns:mc="http://schemas.openxmlformats.org/markup-compatibility/2006" xmlns:aink="http://schemas.microsoft.com/office/drawing/2016/ink" xmlns:am3d="http://schemas.microsoft.com/office/drawing/2017/model3d" xmlns:o="urn:schemas-microsoft-com:office:office" xmlns:oel="http://schemas.microsoft.com/office/2019/extlst" xmlns:r="http://schemas.openxmlformats.org/officeDocument/2006/relationships" xmlns:m="http://schemas.openxmlformats.org/officeDocument/2006/math" xmlns:v="urn:schemas-microsoft-com:vml" xmlns:wp14="http://schemas.microsoft.com/office/word/2010/wordprocessingDrawing" xmlns:wp="http://schemas.openxmlformats.org/drawingml/2006/wordprocessingDrawing" xmlns:w10="urn:schemas-microsoft-com:office:word" xmlns:w="http://schemas.openxmlformats.org/wordprocessingml/2006/main" xmlns:w14="http://schemas.microsoft.com/office/word/2010/wordml" xmlns:w15="http://schemas.microsoft.com/office/word/2012/wordml" xmlns:w16cex="http://schemas.microsoft.com/office/word/2018/wordml/cex" xmlns:w16cid="http://schemas.microsoft.com/office/word/2016/wordml/cid" xmlns:w16="http://schemas.microsoft.com/office/word/2018/wordml" xmlns:w16du="http://schemas.microsoft.com/office/word/2023/wordml/word16du" xmlns:w16sdtdh="http://schemas.microsoft.com/office/word/2020/wordml/sdtdatahash" xmlns:w16sdtfl="http://schemas.microsoft.com/office/word/2024/wordml/sdtformatlock" xmlns:w16se="http://schemas.microsoft.com/office/word/2015/wordml/symex" xmlns:wpg="http://schemas.microsoft.com/office/word/2010/wordprocessingGroup" xmlns:wpi="http://schemas.microsoft.com/office/word/2010/wordprocessingInk" xmlns:wne="http://schemas.microsoft.com/office/word/2006/wordml" xmlns:wps="http://schemas.microsoft.com/office/word/2010/wordprocessingShape" mc:Ignorable="w14 w15 w16se w16cid w16 w16cex w16sdtdh w16sdtfl w16du wp14">
   <w:body>
     <w:p>
       <w:pPr>
@@ -454,13 +454,8 @@
         <w:spacing w:after="80" w:line="280" w:lineRule="auto"/>
       </w:pPr>
       <w:r>
-        <w:t xml:space="preserve">17. Vista paciente: prescripción </w:t>
-      </w:r>
-      <w:proofErr w:type="spellStart"/>
-      <w:r>
-        <w:t>multi-fármaco</w:t>
-      </w:r>
-      <w:proofErr w:type="spellEnd"/>
+        <w:t>17. Vista paciente: prescripción multi-fármaco</w:t>
+      </w:r>
     </w:p>
     <w:p>
       <w:pPr>
@@ -727,12 +722,6 @@
         <w:gridCol w:w="9360"/>
       </w:tblGrid>
       <w:tr>
-        <w:tblPrEx>
-          <w:tblCellMar>
-            <w:top w:w="0" w:type="dxa"/>
-            <w:bottom w:w="0" w:type="dxa"/>
-          </w:tblCellMar>
-        </w:tblPrEx>
         <w:tc>
           <w:tcPr>
             <w:tcW w:w="9360" w:type="dxa"/>
@@ -810,12 +799,6 @@
         <w:gridCol w:w="9360"/>
       </w:tblGrid>
       <w:tr>
-        <w:tblPrEx>
-          <w:tblCellMar>
-            <w:top w:w="0" w:type="dxa"/>
-            <w:bottom w:w="0" w:type="dxa"/>
-          </w:tblCellMar>
-        </w:tblPrEx>
         <w:tc>
           <w:tcPr>
             <w:tcW w:w="9360" w:type="dxa"/>
@@ -1186,12 +1169,6 @@
         <w:gridCol w:w="9360"/>
       </w:tblGrid>
       <w:tr>
-        <w:tblPrEx>
-          <w:tblCellMar>
-            <w:top w:w="0" w:type="dxa"/>
-            <w:bottom w:w="0" w:type="dxa"/>
-          </w:tblCellMar>
-        </w:tblPrEx>
         <w:tc>
           <w:tcPr>
             <w:tcW w:w="9360" w:type="dxa"/>
@@ -1403,15 +1380,15 @@
         </w:drawing>
       </w:r>
       <w:r>
-        <w:t xml:space="preserve">Estos datos persisten entre recargas y entre sesiones (hasta que pulses Nuevo paciente o los borres). Eso significa </w:t>
+        <w:t xml:space="preserve">Estos datos persisten entre recargas y entre sesiones (hasta que pulses Nuevo paciente o los borres). Eso significa que si cierras la </w:t>
       </w:r>
       <w:proofErr w:type="gramStart"/>
       <w:r>
-        <w:t>que</w:t>
+        <w:t>app</w:t>
       </w:r>
       <w:proofErr w:type="gramEnd"/>
       <w:r>
-        <w:t xml:space="preserve"> si cierras la app y la vuelves a abrir, el paciente sigue ahí.</w:t>
+        <w:t xml:space="preserve"> y la vuelves a abrir, el paciente sigue ahí.</w:t>
       </w:r>
     </w:p>
     <w:tbl>
@@ -1435,12 +1412,6 @@
         <w:gridCol w:w="9360"/>
       </w:tblGrid>
       <w:tr>
-        <w:tblPrEx>
-          <w:tblCellMar>
-            <w:top w:w="0" w:type="dxa"/>
-            <w:bottom w:w="0" w:type="dxa"/>
-          </w:tblCellMar>
-        </w:tblPrEx>
         <w:tc>
           <w:tcPr>
             <w:tcW w:w="9360" w:type="dxa"/>
@@ -1963,12 +1934,6 @@
         <w:gridCol w:w="3360"/>
       </w:tblGrid>
       <w:tr>
-        <w:tblPrEx>
-          <w:tblCellMar>
-            <w:top w:w="0" w:type="dxa"/>
-            <w:bottom w:w="0" w:type="dxa"/>
-          </w:tblCellMar>
-        </w:tblPrEx>
         <w:trPr>
           <w:tblHeader/>
         </w:trPr>
@@ -2058,12 +2023,6 @@
         </w:tc>
       </w:tr>
       <w:tr>
-        <w:tblPrEx>
-          <w:tblCellMar>
-            <w:top w:w="0" w:type="dxa"/>
-            <w:bottom w:w="0" w:type="dxa"/>
-          </w:tblCellMar>
-        </w:tblPrEx>
         <w:tc>
           <w:tcPr>
             <w:tcW w:w="1800" w:type="dxa"/>
@@ -2163,12 +2122,6 @@
         </w:tc>
       </w:tr>
       <w:tr>
-        <w:tblPrEx>
-          <w:tblCellMar>
-            <w:top w:w="0" w:type="dxa"/>
-            <w:bottom w:w="0" w:type="dxa"/>
-          </w:tblCellMar>
-        </w:tblPrEx>
         <w:tc>
           <w:tcPr>
             <w:tcW w:w="1800" w:type="dxa"/>
@@ -2252,12 +2205,6 @@
         </w:tc>
       </w:tr>
       <w:tr>
-        <w:tblPrEx>
-          <w:tblCellMar>
-            <w:top w:w="0" w:type="dxa"/>
-            <w:bottom w:w="0" w:type="dxa"/>
-          </w:tblCellMar>
-        </w:tblPrEx>
         <w:tc>
           <w:tcPr>
             <w:tcW w:w="1800" w:type="dxa"/>
@@ -2357,12 +2304,6 @@
         </w:tc>
       </w:tr>
       <w:tr>
-        <w:tblPrEx>
-          <w:tblCellMar>
-            <w:top w:w="0" w:type="dxa"/>
-            <w:bottom w:w="0" w:type="dxa"/>
-          </w:tblCellMar>
-        </w:tblPrEx>
         <w:tc>
           <w:tcPr>
             <w:tcW w:w="1800" w:type="dxa"/>
@@ -2610,12 +2551,6 @@
         <w:gridCol w:w="9360"/>
       </w:tblGrid>
       <w:tr>
-        <w:tblPrEx>
-          <w:tblCellMar>
-            <w:top w:w="0" w:type="dxa"/>
-            <w:bottom w:w="0" w:type="dxa"/>
-          </w:tblCellMar>
-        </w:tblPrEx>
         <w:tc>
           <w:tcPr>
             <w:tcW w:w="9360" w:type="dxa"/>
@@ -2943,12 +2878,6 @@
         <w:gridCol w:w="2200"/>
       </w:tblGrid>
       <w:tr>
-        <w:tblPrEx>
-          <w:tblCellMar>
-            <w:top w:w="0" w:type="dxa"/>
-            <w:bottom w:w="0" w:type="dxa"/>
-          </w:tblCellMar>
-        </w:tblPrEx>
         <w:trPr>
           <w:tblHeader/>
         </w:trPr>
@@ -3038,12 +2967,6 @@
         </w:tc>
       </w:tr>
       <w:tr>
-        <w:tblPrEx>
-          <w:tblCellMar>
-            <w:top w:w="0" w:type="dxa"/>
-            <w:bottom w:w="0" w:type="dxa"/>
-          </w:tblCellMar>
-        </w:tblPrEx>
         <w:tc>
           <w:tcPr>
             <w:tcW w:w="2400" w:type="dxa"/>
@@ -3136,12 +3059,6 @@
         </w:tc>
       </w:tr>
       <w:tr>
-        <w:tblPrEx>
-          <w:tblCellMar>
-            <w:top w:w="0" w:type="dxa"/>
-            <w:bottom w:w="0" w:type="dxa"/>
-          </w:tblCellMar>
-        </w:tblPrEx>
         <w:tc>
           <w:tcPr>
             <w:tcW w:w="2400" w:type="dxa"/>
@@ -3250,12 +3167,6 @@
         </w:tc>
       </w:tr>
       <w:tr>
-        <w:tblPrEx>
-          <w:tblCellMar>
-            <w:top w:w="0" w:type="dxa"/>
-            <w:bottom w:w="0" w:type="dxa"/>
-          </w:tblCellMar>
-        </w:tblPrEx>
         <w:tc>
           <w:tcPr>
             <w:tcW w:w="2400" w:type="dxa"/>
@@ -3348,12 +3259,6 @@
         </w:tc>
       </w:tr>
       <w:tr>
-        <w:tblPrEx>
-          <w:tblCellMar>
-            <w:top w:w="0" w:type="dxa"/>
-            <w:bottom w:w="0" w:type="dxa"/>
-          </w:tblCellMar>
-        </w:tblPrEx>
         <w:tc>
           <w:tcPr>
             <w:tcW w:w="2400" w:type="dxa"/>
@@ -3446,12 +3351,6 @@
         </w:tc>
       </w:tr>
       <w:tr>
-        <w:tblPrEx>
-          <w:tblCellMar>
-            <w:top w:w="0" w:type="dxa"/>
-            <w:bottom w:w="0" w:type="dxa"/>
-          </w:tblCellMar>
-        </w:tblPrEx>
         <w:tc>
           <w:tcPr>
             <w:tcW w:w="2400" w:type="dxa"/>
@@ -3544,12 +3443,6 @@
         </w:tc>
       </w:tr>
       <w:tr>
-        <w:tblPrEx>
-          <w:tblCellMar>
-            <w:top w:w="0" w:type="dxa"/>
-            <w:bottom w:w="0" w:type="dxa"/>
-          </w:tblCellMar>
-        </w:tblPrEx>
         <w:tc>
           <w:tcPr>
             <w:tcW w:w="2400" w:type="dxa"/>
@@ -3642,12 +3535,6 @@
         </w:tc>
       </w:tr>
       <w:tr>
-        <w:tblPrEx>
-          <w:tblCellMar>
-            <w:top w:w="0" w:type="dxa"/>
-            <w:bottom w:w="0" w:type="dxa"/>
-          </w:tblCellMar>
-        </w:tblPrEx>
         <w:tc>
           <w:tcPr>
             <w:tcW w:w="2400" w:type="dxa"/>
@@ -3740,12 +3627,6 @@
         </w:tc>
       </w:tr>
       <w:tr>
-        <w:tblPrEx>
-          <w:tblCellMar>
-            <w:top w:w="0" w:type="dxa"/>
-            <w:bottom w:w="0" w:type="dxa"/>
-          </w:tblCellMar>
-        </w:tblPrEx>
         <w:tc>
           <w:tcPr>
             <w:tcW w:w="2400" w:type="dxa"/>
@@ -3845,12 +3726,6 @@
         </w:tc>
       </w:tr>
       <w:tr>
-        <w:tblPrEx>
-          <w:tblCellMar>
-            <w:top w:w="0" w:type="dxa"/>
-            <w:bottom w:w="0" w:type="dxa"/>
-          </w:tblCellMar>
-        </w:tblPrEx>
         <w:tc>
           <w:tcPr>
             <w:tcW w:w="2400" w:type="dxa"/>
@@ -3943,12 +3818,6 @@
         </w:tc>
       </w:tr>
       <w:tr>
-        <w:tblPrEx>
-          <w:tblCellMar>
-            <w:top w:w="0" w:type="dxa"/>
-            <w:bottom w:w="0" w:type="dxa"/>
-          </w:tblCellMar>
-        </w:tblPrEx>
         <w:tc>
           <w:tcPr>
             <w:tcW w:w="2400" w:type="dxa"/>
@@ -4032,12 +3901,6 @@
         </w:tc>
       </w:tr>
       <w:tr>
-        <w:tblPrEx>
-          <w:tblCellMar>
-            <w:top w:w="0" w:type="dxa"/>
-            <w:bottom w:w="0" w:type="dxa"/>
-          </w:tblCellMar>
-        </w:tblPrEx>
         <w:tc>
           <w:tcPr>
             <w:tcW w:w="2400" w:type="dxa"/>
@@ -4176,12 +4039,6 @@
         <w:gridCol w:w="9360"/>
       </w:tblGrid>
       <w:tr>
-        <w:tblPrEx>
-          <w:tblCellMar>
-            <w:top w:w="0" w:type="dxa"/>
-            <w:bottom w:w="0" w:type="dxa"/>
-          </w:tblCellMar>
-        </w:tblPrEx>
         <w:tc>
           <w:tcPr>
             <w:tcW w:w="9360" w:type="dxa"/>
@@ -4581,13 +4438,8 @@
         <w:pStyle w:val="Ttulo1"/>
       </w:pPr>
       <w:r>
-        <w:t xml:space="preserve">17. Vista paciente: prescripción </w:t>
-      </w:r>
-      <w:proofErr w:type="spellStart"/>
-      <w:r>
-        <w:t>multi-fármaco</w:t>
-      </w:r>
-      <w:proofErr w:type="spellEnd"/>
+        <w:t>17. Vista paciente: prescripción multi-fármaco</w:t>
+      </w:r>
     </w:p>
     <w:p>
       <w:pPr>
@@ -4789,12 +4641,6 @@
         <w:gridCol w:w="9360"/>
       </w:tblGrid>
       <w:tr>
-        <w:tblPrEx>
-          <w:tblCellMar>
-            <w:top w:w="0" w:type="dxa"/>
-            <w:bottom w:w="0" w:type="dxa"/>
-          </w:tblCellMar>
-        </w:tblPrEx>
         <w:tc>
           <w:tcPr>
             <w:tcW w:w="9360" w:type="dxa"/>
@@ -4965,12 +4811,6 @@
         <w:gridCol w:w="9360"/>
       </w:tblGrid>
       <w:tr>
-        <w:tblPrEx>
-          <w:tblCellMar>
-            <w:top w:w="0" w:type="dxa"/>
-            <w:bottom w:w="0" w:type="dxa"/>
-          </w:tblCellMar>
-        </w:tblPrEx>
         <w:tc>
           <w:tcPr>
             <w:tcW w:w="9360" w:type="dxa"/>
@@ -5047,7 +4887,7 @@
           <w:noProof/>
         </w:rPr>
         <w:drawing>
-          <wp:anchor distT="0" distB="0" distL="114300" distR="114300" simplePos="0" relativeHeight="251670528" behindDoc="1" locked="0" layoutInCell="1" allowOverlap="1" wp14:anchorId="4C1E15ED" wp14:editId="71B5701D">
+          <wp:anchor distT="0" distB="0" distL="114300" distR="114300" simplePos="0" relativeHeight="251670528" behindDoc="1" locked="0" layoutInCell="1" allowOverlap="1" wp14:anchorId="4C1E15ED" wp14:editId="4AE5CC60">
             <wp:simplePos x="0" y="0"/>
             <wp:positionH relativeFrom="column">
               <wp:posOffset>3571875</wp:posOffset>
@@ -5931,7 +5771,13 @@
       </w:r>
       <w:proofErr w:type="spellEnd"/>
       <w:r>
-        <w:t xml:space="preserve"> ha sido desarrollada por Carlos J. Galán Doval, pediatra.</w:t>
+        <w:t xml:space="preserve"> ha sido desarrollada por Carlos J. Galán Doval, </w:t>
+      </w:r>
+      <w:r>
+        <w:t>Especialista en Urgencias y Medicina Familiar y Comunitaria</w:t>
+      </w:r>
+      <w:r>
+        <w:t>.</w:t>
       </w:r>
     </w:p>
     <w:p>
@@ -6050,7 +5896,7 @@
 </file>
 
 <file path=word/endnotes.xml><?xml version="1.0" encoding="utf-8"?>
-<w:endnotes xmlns:wpc="http://schemas.microsoft.com/office/word/2010/wordprocessingCanvas" xmlns:cx="http://schemas.microsoft.com/office/drawing/2014/chartex" xmlns:cx1="http://schemas.microsoft.com/office/drawing/2015/9/8/chartex" xmlns:cx2="http://schemas.microsoft.com/office/drawing/2015/10/21/chartex" xmlns:cx3="http://schemas.microsoft.com/office/drawing/2016/5/9/chartex" xmlns:cx4="http://schemas.microsoft.com/office/drawing/2016/5/10/chartex" xmlns:cx5="http://schemas.microsoft.com/office/drawing/2016/5/11/chartex" xmlns:cx6="http://schemas.microsoft.com/office/drawing/2016/5/12/chartex" xmlns:cx7="http://schemas.microsoft.com/office/drawing/2016/5/13/chartex" xmlns:cx8="http://schemas.microsoft.com/office/drawing/2016/5/14/chartex" xmlns:mc="http://schemas.openxmlformats.org/markup-compatibility/2006" xmlns:aink="http://schemas.microsoft.com/office/drawing/2016/ink" xmlns:am3d="http://schemas.microsoft.com/office/drawing/2017/model3d" xmlns:o="urn:schemas-microsoft-com:office:office" xmlns:oel="http://schemas.microsoft.com/office/2019/extlst" xmlns:r="http://schemas.openxmlformats.org/officeDocument/2006/relationships" xmlns:m="http://schemas.openxmlformats.org/officeDocument/2006/math" xmlns:v="urn:schemas-microsoft-com:vml" xmlns:wp14="http://schemas.microsoft.com/office/word/2010/wordprocessingDrawing" xmlns:wp="http://schemas.openxmlformats.org/drawingml/2006/wordprocessingDrawing" xmlns:w10="urn:schemas-microsoft-com:office:word" xmlns:w="http://schemas.openxmlformats.org/wordprocessingml/2006/main" xmlns:w14="http://schemas.microsoft.com/office/word/2010/wordml" xmlns:w15="http://schemas.microsoft.com/office/word/2012/wordml" xmlns:w16cex="http://schemas.microsoft.com/office/word/2018/wordml/cex" xmlns:w16cid="http://schemas.microsoft.com/office/word/2016/wordml/cid" xmlns:w16="http://schemas.microsoft.com/office/word/2018/wordml" xmlns:w16du="http://schemas.microsoft.com/office/word/2023/wordml/word16du" xmlns:w16sdtdh="http://schemas.microsoft.com/office/word/2020/wordml/sdtdatahash" xmlns:w16se="http://schemas.microsoft.com/office/word/2015/wordml/symex" xmlns:wpg="http://schemas.microsoft.com/office/word/2010/wordprocessingGroup" xmlns:wpi="http://schemas.microsoft.com/office/word/2010/wordprocessingInk" xmlns:wne="http://schemas.microsoft.com/office/word/2006/wordml" xmlns:wps="http://schemas.microsoft.com/office/word/2010/wordprocessingShape" mc:Ignorable="w14 w15 w16se w16cid w16 w16cex w16sdtdh w16du wp14">
+<w:endnotes xmlns:wpc="http://schemas.microsoft.com/office/word/2010/wordprocessingCanvas" xmlns:cx="http://schemas.microsoft.com/office/drawing/2014/chartex" xmlns:cx1="http://schemas.microsoft.com/office/drawing/2015/9/8/chartex" xmlns:cx2="http://schemas.microsoft.com/office/drawing/2015/10/21/chartex" xmlns:cx3="http://schemas.microsoft.com/office/drawing/2016/5/9/chartex" xmlns:cx4="http://schemas.microsoft.com/office/drawing/2016/5/10/chartex" xmlns:cx5="http://schemas.microsoft.com/office/drawing/2016/5/11/chartex" xmlns:cx6="http://schemas.microsoft.com/office/drawing/2016/5/12/chartex" xmlns:cx7="http://schemas.microsoft.com/office/drawing/2016/5/13/chartex" xmlns:cx8="http://schemas.microsoft.com/office/drawing/2016/5/14/chartex" xmlns:mc="http://schemas.openxmlformats.org/markup-compatibility/2006" xmlns:aink="http://schemas.microsoft.com/office/drawing/2016/ink" xmlns:am3d="http://schemas.microsoft.com/office/drawing/2017/model3d" xmlns:o="urn:schemas-microsoft-com:office:office" xmlns:oel="http://schemas.microsoft.com/office/2019/extlst" xmlns:r="http://schemas.openxmlformats.org/officeDocument/2006/relationships" xmlns:m="http://schemas.openxmlformats.org/officeDocument/2006/math" xmlns:v="urn:schemas-microsoft-com:vml" xmlns:wp14="http://schemas.microsoft.com/office/word/2010/wordprocessingDrawing" xmlns:wp="http://schemas.openxmlformats.org/drawingml/2006/wordprocessingDrawing" xmlns:w10="urn:schemas-microsoft-com:office:word" xmlns:w="http://schemas.openxmlformats.org/wordprocessingml/2006/main" xmlns:w14="http://schemas.microsoft.com/office/word/2010/wordml" xmlns:w15="http://schemas.microsoft.com/office/word/2012/wordml" xmlns:w16cex="http://schemas.microsoft.com/office/word/2018/wordml/cex" xmlns:w16cid="http://schemas.microsoft.com/office/word/2016/wordml/cid" xmlns:w16="http://schemas.microsoft.com/office/word/2018/wordml" xmlns:w16du="http://schemas.microsoft.com/office/word/2023/wordml/word16du" xmlns:w16sdtdh="http://schemas.microsoft.com/office/word/2020/wordml/sdtdatahash" xmlns:w16sdtfl="http://schemas.microsoft.com/office/word/2024/wordml/sdtformatlock" xmlns:w16se="http://schemas.microsoft.com/office/word/2015/wordml/symex" xmlns:wpg="http://schemas.microsoft.com/office/word/2010/wordprocessingGroup" xmlns:wpi="http://schemas.microsoft.com/office/word/2010/wordprocessingInk" xmlns:wne="http://schemas.microsoft.com/office/word/2006/wordml" xmlns:wps="http://schemas.microsoft.com/office/word/2010/wordprocessingShape" mc:Ignorable="w14 w15 w16se w16cid w16 w16cex w16sdtdh w16sdtfl w16du wp14">
   <w:endnote w:type="separator" w:id="-1">
     <w:p>
       <w:r>
@@ -6069,7 +5915,7 @@
 </file>
 
 <file path=word/footer1.xml><?xml version="1.0" encoding="utf-8"?>
-<w:ftr xmlns:wpc="http://schemas.microsoft.com/office/word/2010/wordprocessingCanvas" xmlns:cx="http://schemas.microsoft.com/office/drawing/2014/chartex" xmlns:cx1="http://schemas.microsoft.com/office/drawing/2015/9/8/chartex" xmlns:cx2="http://schemas.microsoft.com/office/drawing/2015/10/21/chartex" xmlns:cx3="http://schemas.microsoft.com/office/drawing/2016/5/9/chartex" xmlns:cx4="http://schemas.microsoft.com/office/drawing/2016/5/10/chartex" xmlns:cx5="http://schemas.microsoft.com/office/drawing/2016/5/11/chartex" xmlns:cx6="http://schemas.microsoft.com/office/drawing/2016/5/12/chartex" xmlns:cx7="http://schemas.microsoft.com/office/drawing/2016/5/13/chartex" xmlns:cx8="http://schemas.microsoft.com/office/drawing/2016/5/14/chartex" xmlns:mc="http://schemas.openxmlformats.org/markup-compatibility/2006" xmlns:aink="http://schemas.microsoft.com/office/drawing/2016/ink" xmlns:am3d="http://schemas.microsoft.com/office/drawing/2017/model3d" xmlns:o="urn:schemas-microsoft-com:office:office" xmlns:oel="http://schemas.microsoft.com/office/2019/extlst" xmlns:r="http://schemas.openxmlformats.org/officeDocument/2006/relationships" xmlns:m="http://schemas.openxmlformats.org/officeDocument/2006/math" xmlns:v="urn:schemas-microsoft-com:vml" xmlns:wp14="http://schemas.microsoft.com/office/word/2010/wordprocessingDrawing" xmlns:wp="http://schemas.openxmlformats.org/drawingml/2006/wordprocessingDrawing" xmlns:w10="urn:schemas-microsoft-com:office:word" xmlns:w="http://schemas.openxmlformats.org/wordprocessingml/2006/main" xmlns:w14="http://schemas.microsoft.com/office/word/2010/wordml" xmlns:w15="http://schemas.microsoft.com/office/word/2012/wordml" xmlns:w16cex="http://schemas.microsoft.com/office/word/2018/wordml/cex" xmlns:w16cid="http://schemas.microsoft.com/office/word/2016/wordml/cid" xmlns:w16="http://schemas.microsoft.com/office/word/2018/wordml" xmlns:w16du="http://schemas.microsoft.com/office/word/2023/wordml/word16du" xmlns:w16sdtdh="http://schemas.microsoft.com/office/word/2020/wordml/sdtdatahash" xmlns:w16se="http://schemas.microsoft.com/office/word/2015/wordml/symex" xmlns:wpg="http://schemas.microsoft.com/office/word/2010/wordprocessingGroup" xmlns:wpi="http://schemas.microsoft.com/office/word/2010/wordprocessingInk" xmlns:wne="http://schemas.microsoft.com/office/word/2006/wordml" xmlns:wps="http://schemas.microsoft.com/office/word/2010/wordprocessingShape" mc:Ignorable="w14 w15 w16se w16cid w16 w16cex w16sdtdh w16du wp14">
+<w:ftr xmlns:wpc="http://schemas.microsoft.com/office/word/2010/wordprocessingCanvas" xmlns:cx="http://schemas.microsoft.com/office/drawing/2014/chartex" xmlns:cx1="http://schemas.microsoft.com/office/drawing/2015/9/8/chartex" xmlns:cx2="http://schemas.microsoft.com/office/drawing/2015/10/21/chartex" xmlns:cx3="http://schemas.microsoft.com/office/drawing/2016/5/9/chartex" xmlns:cx4="http://schemas.microsoft.com/office/drawing/2016/5/10/chartex" xmlns:cx5="http://schemas.microsoft.com/office/drawing/2016/5/11/chartex" xmlns:cx6="http://schemas.microsoft.com/office/drawing/2016/5/12/chartex" xmlns:cx7="http://schemas.microsoft.com/office/drawing/2016/5/13/chartex" xmlns:cx8="http://schemas.microsoft.com/office/drawing/2016/5/14/chartex" xmlns:mc="http://schemas.openxmlformats.org/markup-compatibility/2006" xmlns:aink="http://schemas.microsoft.com/office/drawing/2016/ink" xmlns:am3d="http://schemas.microsoft.com/office/drawing/2017/model3d" xmlns:o="urn:schemas-microsoft-com:office:office" xmlns:oel="http://schemas.microsoft.com/office/2019/extlst" xmlns:r="http://schemas.openxmlformats.org/officeDocument/2006/relationships" xmlns:m="http://schemas.openxmlformats.org/officeDocument/2006/math" xmlns:v="urn:schemas-microsoft-com:vml" xmlns:wp14="http://schemas.microsoft.com/office/word/2010/wordprocessingDrawing" xmlns:wp="http://schemas.openxmlformats.org/drawingml/2006/wordprocessingDrawing" xmlns:w10="urn:schemas-microsoft-com:office:word" xmlns:w="http://schemas.openxmlformats.org/wordprocessingml/2006/main" xmlns:w14="http://schemas.microsoft.com/office/word/2010/wordml" xmlns:w15="http://schemas.microsoft.com/office/word/2012/wordml" xmlns:w16cex="http://schemas.microsoft.com/office/word/2018/wordml/cex" xmlns:w16cid="http://schemas.microsoft.com/office/word/2016/wordml/cid" xmlns:w16="http://schemas.microsoft.com/office/word/2018/wordml" xmlns:w16du="http://schemas.microsoft.com/office/word/2023/wordml/word16du" xmlns:w16sdtdh="http://schemas.microsoft.com/office/word/2020/wordml/sdtdatahash" xmlns:w16sdtfl="http://schemas.microsoft.com/office/word/2024/wordml/sdtformatlock" xmlns:w16se="http://schemas.microsoft.com/office/word/2015/wordml/symex" xmlns:wpg="http://schemas.microsoft.com/office/word/2010/wordprocessingGroup" xmlns:wpi="http://schemas.microsoft.com/office/word/2010/wordprocessingInk" xmlns:wne="http://schemas.microsoft.com/office/word/2006/wordml" xmlns:wps="http://schemas.microsoft.com/office/word/2010/wordprocessingShape" mc:Ignorable="w14 w15 w16se w16cid w16 w16cex w16sdtdh w16sdtfl w16du wp14">
   <w:p>
     <w:pPr>
       <w:jc w:val="center"/>
@@ -6082,7 +5928,29 @@
         <w:sz w:val="18"/>
         <w:szCs w:val="18"/>
       </w:rPr>
-      <w:t xml:space="preserve">Carlos J. Galán Doval  ·  </w:t>
+      <w:t xml:space="preserve">Carlos J. Galán </w:t>
+    </w:r>
+    <w:proofErr w:type="gramStart"/>
+    <w:r>
+      <w:rPr>
+        <w:i/>
+        <w:iCs/>
+        <w:color w:val="6B7280"/>
+        <w:sz w:val="18"/>
+        <w:szCs w:val="18"/>
+      </w:rPr>
+      <w:t>Doval  ·</w:t>
+    </w:r>
+    <w:proofErr w:type="gramEnd"/>
+    <w:r>
+      <w:rPr>
+        <w:i/>
+        <w:iCs/>
+        <w:color w:val="6B7280"/>
+        <w:sz w:val="18"/>
+        <w:szCs w:val="18"/>
+      </w:rPr>
+      <w:t xml:space="preserve">  </w:t>
     </w:r>
     <w:r>
       <w:rPr>
@@ -6187,7 +6055,7 @@
 </file>
 
 <file path=word/footnotes.xml><?xml version="1.0" encoding="utf-8"?>
-<w:footnotes xmlns:wpc="http://schemas.microsoft.com/office/word/2010/wordprocessingCanvas" xmlns:cx="http://schemas.microsoft.com/office/drawing/2014/chartex" xmlns:cx1="http://schemas.microsoft.com/office/drawing/2015/9/8/chartex" xmlns:cx2="http://schemas.microsoft.com/office/drawing/2015/10/21/chartex" xmlns:cx3="http://schemas.microsoft.com/office/drawing/2016/5/9/chartex" xmlns:cx4="http://schemas.microsoft.com/office/drawing/2016/5/10/chartex" xmlns:cx5="http://schemas.microsoft.com/office/drawing/2016/5/11/chartex" xmlns:cx6="http://schemas.microsoft.com/office/drawing/2016/5/12/chartex" xmlns:cx7="http://schemas.microsoft.com/office/drawing/2016/5/13/chartex" xmlns:cx8="http://schemas.microsoft.com/office/drawing/2016/5/14/chartex" xmlns:mc="http://schemas.openxmlformats.org/markup-compatibility/2006" xmlns:aink="http://schemas.microsoft.com/office/drawing/2016/ink" xmlns:am3d="http://schemas.microsoft.com/office/drawing/2017/model3d" xmlns:o="urn:schemas-microsoft-com:office:office" xmlns:oel="http://schemas.microsoft.com/office/2019/extlst" xmlns:r="http://schemas.openxmlformats.org/officeDocument/2006/relationships" xmlns:m="http://schemas.openxmlformats.org/officeDocument/2006/math" xmlns:v="urn:schemas-microsoft-com:vml" xmlns:wp14="http://schemas.microsoft.com/office/word/2010/wordprocessingDrawing" xmlns:wp="http://schemas.openxmlformats.org/drawingml/2006/wordprocessingDrawing" xmlns:w10="urn:schemas-microsoft-com:office:word" xmlns:w="http://schemas.openxmlformats.org/wordprocessingml/2006/main" xmlns:w14="http://schemas.microsoft.com/office/word/2010/wordml" xmlns:w15="http://schemas.microsoft.com/office/word/2012/wordml" xmlns:w16cex="http://schemas.microsoft.com/office/word/2018/wordml/cex" xmlns:w16cid="http://schemas.microsoft.com/office/word/2016/wordml/cid" xmlns:w16="http://schemas.microsoft.com/office/word/2018/wordml" xmlns:w16du="http://schemas.microsoft.com/office/word/2023/wordml/word16du" xmlns:w16sdtdh="http://schemas.microsoft.com/office/word/2020/wordml/sdtdatahash" xmlns:w16se="http://schemas.microsoft.com/office/word/2015/wordml/symex" xmlns:wpg="http://schemas.microsoft.com/office/word/2010/wordprocessingGroup" xmlns:wpi="http://schemas.microsoft.com/office/word/2010/wordprocessingInk" xmlns:wne="http://schemas.microsoft.com/office/word/2006/wordml" xmlns:wps="http://schemas.microsoft.com/office/word/2010/wordprocessingShape" mc:Ignorable="w14 w15 w16se w16cid w16 w16cex w16sdtdh w16du wp14">
+<w:footnotes xmlns:wpc="http://schemas.microsoft.com/office/word/2010/wordprocessingCanvas" xmlns:cx="http://schemas.microsoft.com/office/drawing/2014/chartex" xmlns:cx1="http://schemas.microsoft.com/office/drawing/2015/9/8/chartex" xmlns:cx2="http://schemas.microsoft.com/office/drawing/2015/10/21/chartex" xmlns:cx3="http://schemas.microsoft.com/office/drawing/2016/5/9/chartex" xmlns:cx4="http://schemas.microsoft.com/office/drawing/2016/5/10/chartex" xmlns:cx5="http://schemas.microsoft.com/office/drawing/2016/5/11/chartex" xmlns:cx6="http://schemas.microsoft.com/office/drawing/2016/5/12/chartex" xmlns:cx7="http://schemas.microsoft.com/office/drawing/2016/5/13/chartex" xmlns:cx8="http://schemas.microsoft.com/office/drawing/2016/5/14/chartex" xmlns:mc="http://schemas.openxmlformats.org/markup-compatibility/2006" xmlns:aink="http://schemas.microsoft.com/office/drawing/2016/ink" xmlns:am3d="http://schemas.microsoft.com/office/drawing/2017/model3d" xmlns:o="urn:schemas-microsoft-com:office:office" xmlns:oel="http://schemas.microsoft.com/office/2019/extlst" xmlns:r="http://schemas.openxmlformats.org/officeDocument/2006/relationships" xmlns:m="http://schemas.openxmlformats.org/officeDocument/2006/math" xmlns:v="urn:schemas-microsoft-com:vml" xmlns:wp14="http://schemas.microsoft.com/office/word/2010/wordprocessingDrawing" xmlns:wp="http://schemas.openxmlformats.org/drawingml/2006/wordprocessingDrawing" xmlns:w10="urn:schemas-microsoft-com:office:word" xmlns:w="http://schemas.openxmlformats.org/wordprocessingml/2006/main" xmlns:w14="http://schemas.microsoft.com/office/word/2010/wordml" xmlns:w15="http://schemas.microsoft.com/office/word/2012/wordml" xmlns:w16cex="http://schemas.microsoft.com/office/word/2018/wordml/cex" xmlns:w16cid="http://schemas.microsoft.com/office/word/2016/wordml/cid" xmlns:w16="http://schemas.microsoft.com/office/word/2018/wordml" xmlns:w16du="http://schemas.microsoft.com/office/word/2023/wordml/word16du" xmlns:w16sdtdh="http://schemas.microsoft.com/office/word/2020/wordml/sdtdatahash" xmlns:w16sdtfl="http://schemas.microsoft.com/office/word/2024/wordml/sdtformatlock" xmlns:w16se="http://schemas.microsoft.com/office/word/2015/wordml/symex" xmlns:wpg="http://schemas.microsoft.com/office/word/2010/wordprocessingGroup" xmlns:wpi="http://schemas.microsoft.com/office/word/2010/wordprocessingInk" xmlns:wne="http://schemas.microsoft.com/office/word/2006/wordml" xmlns:wps="http://schemas.microsoft.com/office/word/2010/wordprocessingShape" mc:Ignorable="w14 w15 w16se w16cid w16 w16cex w16sdtdh w16sdtfl w16du wp14">
   <w:footnote w:type="separator" w:id="-1">
     <w:p>
       <w:r>
@@ -6206,7 +6074,7 @@
 </file>
 
 <file path=word/header1.xml><?xml version="1.0" encoding="utf-8"?>
-<w:hdr xmlns:wpc="http://schemas.microsoft.com/office/word/2010/wordprocessingCanvas" xmlns:cx="http://schemas.microsoft.com/office/drawing/2014/chartex" xmlns:cx1="http://schemas.microsoft.com/office/drawing/2015/9/8/chartex" xmlns:cx2="http://schemas.microsoft.com/office/drawing/2015/10/21/chartex" xmlns:cx3="http://schemas.microsoft.com/office/drawing/2016/5/9/chartex" xmlns:cx4="http://schemas.microsoft.com/office/drawing/2016/5/10/chartex" xmlns:cx5="http://schemas.microsoft.com/office/drawing/2016/5/11/chartex" xmlns:cx6="http://schemas.microsoft.com/office/drawing/2016/5/12/chartex" xmlns:cx7="http://schemas.microsoft.com/office/drawing/2016/5/13/chartex" xmlns:cx8="http://schemas.microsoft.com/office/drawing/2016/5/14/chartex" xmlns:mc="http://schemas.openxmlformats.org/markup-compatibility/2006" xmlns:aink="http://schemas.microsoft.com/office/drawing/2016/ink" xmlns:am3d="http://schemas.microsoft.com/office/drawing/2017/model3d" xmlns:o="urn:schemas-microsoft-com:office:office" xmlns:oel="http://schemas.microsoft.com/office/2019/extlst" xmlns:r="http://schemas.openxmlformats.org/officeDocument/2006/relationships" xmlns:m="http://schemas.openxmlformats.org/officeDocument/2006/math" xmlns:v="urn:schemas-microsoft-com:vml" xmlns:wp14="http://schemas.microsoft.com/office/word/2010/wordprocessingDrawing" xmlns:wp="http://schemas.openxmlformats.org/drawingml/2006/wordprocessingDrawing" xmlns:w10="urn:schemas-microsoft-com:office:word" xmlns:w="http://schemas.openxmlformats.org/wordprocessingml/2006/main" xmlns:w14="http://schemas.microsoft.com/office/word/2010/wordml" xmlns:w15="http://schemas.microsoft.com/office/word/2012/wordml" xmlns:w16cex="http://schemas.microsoft.com/office/word/2018/wordml/cex" xmlns:w16cid="http://schemas.microsoft.com/office/word/2016/wordml/cid" xmlns:w16="http://schemas.microsoft.com/office/word/2018/wordml" xmlns:w16du="http://schemas.microsoft.com/office/word/2023/wordml/word16du" xmlns:w16sdtdh="http://schemas.microsoft.com/office/word/2020/wordml/sdtdatahash" xmlns:w16se="http://schemas.microsoft.com/office/word/2015/wordml/symex" xmlns:wpg="http://schemas.microsoft.com/office/word/2010/wordprocessingGroup" xmlns:wpi="http://schemas.microsoft.com/office/word/2010/wordprocessingInk" xmlns:wne="http://schemas.microsoft.com/office/word/2006/wordml" xmlns:wps="http://schemas.microsoft.com/office/word/2010/wordprocessingShape" mc:Ignorable="w14 w15 w16se w16cid w16 w16cex w16sdtdh w16du wp14">
+<w:hdr xmlns:wpc="http://schemas.microsoft.com/office/word/2010/wordprocessingCanvas" xmlns:cx="http://schemas.microsoft.com/office/drawing/2014/chartex" xmlns:cx1="http://schemas.microsoft.com/office/drawing/2015/9/8/chartex" xmlns:cx2="http://schemas.microsoft.com/office/drawing/2015/10/21/chartex" xmlns:cx3="http://schemas.microsoft.com/office/drawing/2016/5/9/chartex" xmlns:cx4="http://schemas.microsoft.com/office/drawing/2016/5/10/chartex" xmlns:cx5="http://schemas.microsoft.com/office/drawing/2016/5/11/chartex" xmlns:cx6="http://schemas.microsoft.com/office/drawing/2016/5/12/chartex" xmlns:cx7="http://schemas.microsoft.com/office/drawing/2016/5/13/chartex" xmlns:cx8="http://schemas.microsoft.com/office/drawing/2016/5/14/chartex" xmlns:mc="http://schemas.openxmlformats.org/markup-compatibility/2006" xmlns:aink="http://schemas.microsoft.com/office/drawing/2016/ink" xmlns:am3d="http://schemas.microsoft.com/office/drawing/2017/model3d" xmlns:o="urn:schemas-microsoft-com:office:office" xmlns:oel="http://schemas.microsoft.com/office/2019/extlst" xmlns:r="http://schemas.openxmlformats.org/officeDocument/2006/relationships" xmlns:m="http://schemas.openxmlformats.org/officeDocument/2006/math" xmlns:v="urn:schemas-microsoft-com:vml" xmlns:wp14="http://schemas.microsoft.com/office/word/2010/wordprocessingDrawing" xmlns:wp="http://schemas.openxmlformats.org/drawingml/2006/wordprocessingDrawing" xmlns:w10="urn:schemas-microsoft-com:office:word" xmlns:w="http://schemas.openxmlformats.org/wordprocessingml/2006/main" xmlns:w14="http://schemas.microsoft.com/office/word/2010/wordml" xmlns:w15="http://schemas.microsoft.com/office/word/2012/wordml" xmlns:w16cex="http://schemas.microsoft.com/office/word/2018/wordml/cex" xmlns:w16cid="http://schemas.microsoft.com/office/word/2016/wordml/cid" xmlns:w16="http://schemas.microsoft.com/office/word/2018/wordml" xmlns:w16du="http://schemas.microsoft.com/office/word/2023/wordml/word16du" xmlns:w16sdtdh="http://schemas.microsoft.com/office/word/2020/wordml/sdtdatahash" xmlns:w16sdtfl="http://schemas.microsoft.com/office/word/2024/wordml/sdtformatlock" xmlns:w16se="http://schemas.microsoft.com/office/word/2015/wordml/symex" xmlns:wpg="http://schemas.microsoft.com/office/word/2010/wordprocessingGroup" xmlns:wpi="http://schemas.microsoft.com/office/word/2010/wordprocessingInk" xmlns:wne="http://schemas.microsoft.com/office/word/2006/wordml" xmlns:wps="http://schemas.microsoft.com/office/word/2010/wordprocessingShape" mc:Ignorable="w14 w15 w16se w16cid w16 w16cex w16sdtdh w16sdtfl w16du wp14">
   <w:p>
     <w:pPr>
       <w:jc w:val="right"/>
@@ -6238,7 +6106,7 @@
 </file>
 
 <file path=word/numbering.xml><?xml version="1.0" encoding="utf-8"?>
-<w:numbering xmlns:wpc="http://schemas.microsoft.com/office/word/2010/wordprocessingCanvas" xmlns:cx="http://schemas.microsoft.com/office/drawing/2014/chartex" xmlns:cx1="http://schemas.microsoft.com/office/drawing/2015/9/8/chartex" xmlns:cx2="http://schemas.microsoft.com/office/drawing/2015/10/21/chartex" xmlns:cx3="http://schemas.microsoft.com/office/drawing/2016/5/9/chartex" xmlns:cx4="http://schemas.microsoft.com/office/drawing/2016/5/10/chartex" xmlns:cx5="http://schemas.microsoft.com/office/drawing/2016/5/11/chartex" xmlns:cx6="http://schemas.microsoft.com/office/drawing/2016/5/12/chartex" xmlns:cx7="http://schemas.microsoft.com/office/drawing/2016/5/13/chartex" xmlns:cx8="http://schemas.microsoft.com/office/drawing/2016/5/14/chartex" xmlns:mc="http://schemas.openxmlformats.org/markup-compatibility/2006" xmlns:aink="http://schemas.microsoft.com/office/drawing/2016/ink" xmlns:am3d="http://schemas.microsoft.com/office/drawing/2017/model3d" xmlns:o="urn:schemas-microsoft-com:office:office" xmlns:oel="http://schemas.microsoft.com/office/2019/extlst" xmlns:r="http://schemas.openxmlformats.org/officeDocument/2006/relationships" xmlns:m="http://schemas.openxmlformats.org/officeDocument/2006/math" xmlns:v="urn:schemas-microsoft-com:vml" xmlns:wp14="http://schemas.microsoft.com/office/word/2010/wordprocessingDrawing" xmlns:wp="http://schemas.openxmlformats.org/drawingml/2006/wordprocessingDrawing" xmlns:w10="urn:schemas-microsoft-com:office:word" xmlns:w="http://schemas.openxmlformats.org/wordprocessingml/2006/main" xmlns:w14="http://schemas.microsoft.com/office/word/2010/wordml" xmlns:w15="http://schemas.microsoft.com/office/word/2012/wordml" xmlns:w16cex="http://schemas.microsoft.com/office/word/2018/wordml/cex" xmlns:w16cid="http://schemas.microsoft.com/office/word/2016/wordml/cid" xmlns:w16="http://schemas.microsoft.com/office/word/2018/wordml" xmlns:w16du="http://schemas.microsoft.com/office/word/2023/wordml/word16du" xmlns:w16sdtdh="http://schemas.microsoft.com/office/word/2020/wordml/sdtdatahash" xmlns:w16se="http://schemas.microsoft.com/office/word/2015/wordml/symex" xmlns:wpg="http://schemas.microsoft.com/office/word/2010/wordprocessingGroup" xmlns:wpi="http://schemas.microsoft.com/office/word/2010/wordprocessingInk" xmlns:wne="http://schemas.microsoft.com/office/word/2006/wordml" xmlns:wps="http://schemas.microsoft.com/office/word/2010/wordprocessingShape" mc:Ignorable="w14 w15 w16se w16cid w16 w16cex w16sdtdh w16du wp14">
+<w:numbering xmlns:wpc="http://schemas.microsoft.com/office/word/2010/wordprocessingCanvas" xmlns:cx="http://schemas.microsoft.com/office/drawing/2014/chartex" xmlns:cx1="http://schemas.microsoft.com/office/drawing/2015/9/8/chartex" xmlns:cx2="http://schemas.microsoft.com/office/drawing/2015/10/21/chartex" xmlns:cx3="http://schemas.microsoft.com/office/drawing/2016/5/9/chartex" xmlns:cx4="http://schemas.microsoft.com/office/drawing/2016/5/10/chartex" xmlns:cx5="http://schemas.microsoft.com/office/drawing/2016/5/11/chartex" xmlns:cx6="http://schemas.microsoft.com/office/drawing/2016/5/12/chartex" xmlns:cx7="http://schemas.microsoft.com/office/drawing/2016/5/13/chartex" xmlns:cx8="http://schemas.microsoft.com/office/drawing/2016/5/14/chartex" xmlns:mc="http://schemas.openxmlformats.org/markup-compatibility/2006" xmlns:aink="http://schemas.microsoft.com/office/drawing/2016/ink" xmlns:am3d="http://schemas.microsoft.com/office/drawing/2017/model3d" xmlns:o="urn:schemas-microsoft-com:office:office" xmlns:oel="http://schemas.microsoft.com/office/2019/extlst" xmlns:r="http://schemas.openxmlformats.org/officeDocument/2006/relationships" xmlns:m="http://schemas.openxmlformats.org/officeDocument/2006/math" xmlns:v="urn:schemas-microsoft-com:vml" xmlns:wp14="http://schemas.microsoft.com/office/word/2010/wordprocessingDrawing" xmlns:wp="http://schemas.openxmlformats.org/drawingml/2006/wordprocessingDrawing" xmlns:w10="urn:schemas-microsoft-com:office:word" xmlns:w="http://schemas.openxmlformats.org/wordprocessingml/2006/main" xmlns:w14="http://schemas.microsoft.com/office/word/2010/wordml" xmlns:w15="http://schemas.microsoft.com/office/word/2012/wordml" xmlns:w16cex="http://schemas.microsoft.com/office/word/2018/wordml/cex" xmlns:w16cid="http://schemas.microsoft.com/office/word/2016/wordml/cid" xmlns:w16="http://schemas.microsoft.com/office/word/2018/wordml" xmlns:w16du="http://schemas.microsoft.com/office/word/2023/wordml/word16du" xmlns:w16sdtdh="http://schemas.microsoft.com/office/word/2020/wordml/sdtdatahash" xmlns:w16sdtfl="http://schemas.microsoft.com/office/word/2024/wordml/sdtformatlock" xmlns:w16se="http://schemas.microsoft.com/office/word/2015/wordml/symex" xmlns:wpg="http://schemas.microsoft.com/office/word/2010/wordprocessingGroup" xmlns:wpi="http://schemas.microsoft.com/office/word/2010/wordprocessingInk" xmlns:wne="http://schemas.microsoft.com/office/word/2006/wordml" xmlns:wps="http://schemas.microsoft.com/office/word/2010/wordprocessingShape" mc:Ignorable="w14 w15 w16se w16cid w16 w16cex w16sdtdh w16sdtfl w16du wp14">
   <w:abstractNum w:abstractNumId="0" w15:restartNumberingAfterBreak="0">
     <w:nsid w:val="0B01689B"/>
     <w:multiLevelType w:val="hybridMultilevel"/>
@@ -6749,7 +6617,7 @@
 </file>
 
 <file path=word/styles.xml><?xml version="1.0" encoding="utf-8"?>
-<w:styles xmlns:mc="http://schemas.openxmlformats.org/markup-compatibility/2006" xmlns:r="http://schemas.openxmlformats.org/officeDocument/2006/relationships" xmlns:w="http://schemas.openxmlformats.org/wordprocessingml/2006/main" xmlns:w14="http://schemas.microsoft.com/office/word/2010/wordml" xmlns:w15="http://schemas.microsoft.com/office/word/2012/wordml" xmlns:w16cex="http://schemas.microsoft.com/office/word/2018/wordml/cex" xmlns:w16cid="http://schemas.microsoft.com/office/word/2016/wordml/cid" xmlns:w16="http://schemas.microsoft.com/office/word/2018/wordml" xmlns:w16du="http://schemas.microsoft.com/office/word/2023/wordml/word16du" xmlns:w16sdtdh="http://schemas.microsoft.com/office/word/2020/wordml/sdtdatahash" xmlns:w16se="http://schemas.microsoft.com/office/word/2015/wordml/symex" mc:Ignorable="w14 w15 w16se w16cid w16 w16cex w16sdtdh w16du">
+<w:styles xmlns:mc="http://schemas.openxmlformats.org/markup-compatibility/2006" xmlns:r="http://schemas.openxmlformats.org/officeDocument/2006/relationships" xmlns:w="http://schemas.openxmlformats.org/wordprocessingml/2006/main" xmlns:w14="http://schemas.microsoft.com/office/word/2010/wordml" xmlns:w15="http://schemas.microsoft.com/office/word/2012/wordml" xmlns:w16cex="http://schemas.microsoft.com/office/word/2018/wordml/cex" xmlns:w16cid="http://schemas.microsoft.com/office/word/2016/wordml/cid" xmlns:w16="http://schemas.microsoft.com/office/word/2018/wordml" xmlns:w16du="http://schemas.microsoft.com/office/word/2023/wordml/word16du" xmlns:w16sdtdh="http://schemas.microsoft.com/office/word/2020/wordml/sdtdatahash" xmlns:w16sdtfl="http://schemas.microsoft.com/office/word/2024/wordml/sdtformatlock" xmlns:w16se="http://schemas.microsoft.com/office/word/2015/wordml/symex" mc:Ignorable="w14 w15 w16se w16cid w16 w16cex w16sdtdh w16sdtfl w16du">
   <w:docDefaults>
     <w:rPrDefault>
       <w:rPr>

</xml_diff>